<commit_message>
Regenerate REFERENCES.docx with live Pages URL
</commit_message>
<xml_diff>
--- a/REFERENCES.docx
+++ b/REFERENCES.docx
@@ -203,7 +203,7 @@
         <w:spacing w:after="60"/>
       </w:pPr>
       <w:r>
-        <w:t xml:space="preserve">Cloudflare Pages preview URL: [TODO: expected https://50fivestargels.pages.dev once the Pages project exists]</w:t>
+        <w:t xml:space="preserve">Cloudflare Pages URL: https://50fivestargels.pages.dev (live since 2026-07-02)</w:t>
       </w:r>
     </w:p>
     <w:p>
@@ -365,7 +365,7 @@
         <w:spacing w:after="120"/>
       </w:pPr>
       <w:r>
-        <w:t xml:space="preserve">Pushing to main triggers a Cloudflare Pages deploy automatically once the Pages project is connected. [TODO: confirm after first successful deploy]</w:t>
+        <w:t xml:space="preserve">Pushing to main triggers a Cloudflare Pages deploy automatically. (confirmed 2026-07-02)</w:t>
       </w:r>
     </w:p>
     <w:p>
@@ -566,7 +566,7 @@
         <w:t xml:space="preserve">src/lib/seo.ts</w:t>
       </w:r>
       <w:r>
-        <w:t xml:space="preserve"> (SITE_URL placeholder — update with the real domain)</w:t>
+        <w:t xml:space="preserve"> (SITE_URL = pages.dev URL; update when a custom domain is added)</w:t>
       </w:r>
     </w:p>
     <w:p>
@@ -755,7 +755,7 @@
         <w:spacing w:after="60"/>
       </w:pPr>
       <w:r>
-        <w:t xml:space="preserve">Project: [TODO: not created yet — Dashboard, Workers &amp; Pages, Create, Pages, Connect to Git, select 50fivestargels]</w:t>
+        <w:t xml:space="preserve">Project: 50fivestargels — live at https://50fivestargels.pages.dev</w:t>
       </w:r>
     </w:p>
     <w:p>

</xml_diff>

<commit_message>
Update REFERENCES for the prompt generator (V1.1 paths)
</commit_message>
<xml_diff>
--- a/REFERENCES.docx
+++ b/REFERENCES.docx
@@ -136,7 +136,7 @@
         <w:t xml:space="preserve">React 19</w:t>
       </w:r>
       <w:r>
-        <w:t xml:space="preserve"> — islands only; the Race Fuel Cost Calculator is the sole island (client:load), everything else is static</w:t>
+        <w:t xml:space="preserve"> — islands only: the Race Fuel Cost Calculator and the AI Prompt Generator (client:load); everything else is static</w:t>
       </w:r>
     </w:p>
     <w:p>
@@ -458,6 +458,69 @@
           <w:szCs w:val="20"/>
         </w:rPr>
         <w:t xml:space="preserve">src/lib/fuelMath.ts</w:t>
+      </w:r>
+    </w:p>
+    <w:p>
+      <w:pPr>
+        <w:pStyle w:val="ListParagraph"/>
+        <w:numPr>
+          <w:ilvl w:val="0"/>
+          <w:numId w:val="2"/>
+        </w:numPr>
+        <w:spacing w:after="60"/>
+      </w:pPr>
+      <w:r>
+        <w:t xml:space="preserve">Prompt generator page (canonical slug /ai-race-fuel-prompt-generator/): </w:t>
+      </w:r>
+      <w:r>
+        <w:rPr>
+          <w:rFonts w:ascii="Consolas" w:cs="Consolas" w:eastAsia="Consolas" w:hAnsi="Consolas"/>
+          <w:sz w:val="20"/>
+          <w:szCs w:val="20"/>
+        </w:rPr>
+        <w:t xml:space="preserve">src/pages/ai-race-fuel-prompt-generator.astro</w:t>
+      </w:r>
+    </w:p>
+    <w:p>
+      <w:pPr>
+        <w:pStyle w:val="ListParagraph"/>
+        <w:numPr>
+          <w:ilvl w:val="0"/>
+          <w:numId w:val="2"/>
+        </w:numPr>
+        <w:spacing w:after="60"/>
+      </w:pPr>
+      <w:r>
+        <w:t xml:space="preserve">Prompt generator React island: </w:t>
+      </w:r>
+      <w:r>
+        <w:rPr>
+          <w:rFonts w:ascii="Consolas" w:cs="Consolas" w:eastAsia="Consolas" w:hAnsi="Consolas"/>
+          <w:sz w:val="20"/>
+          <w:szCs w:val="20"/>
+        </w:rPr>
+        <w:t xml:space="preserve">src/components/promptgen/PromptGenerator.tsx</w:t>
+      </w:r>
+    </w:p>
+    <w:p>
+      <w:pPr>
+        <w:pStyle w:val="ListParagraph"/>
+        <w:numPr>
+          <w:ilvl w:val="0"/>
+          <w:numId w:val="2"/>
+        </w:numPr>
+        <w:spacing w:after="60"/>
+      </w:pPr>
+      <w:r>
+        <w:t xml:space="preserve">Prompt assembly (pure functions): </w:t>
+      </w:r>
+      <w:r>
+        <w:rPr>
+          <w:rFonts w:ascii="Consolas" w:cs="Consolas" w:eastAsia="Consolas" w:hAnsi="Consolas"/>
+          <w:sz w:val="20"/>
+          <w:szCs w:val="20"/>
+        </w:rPr>
+        <w:t xml:space="preserve">src/lib/promptBuilder.ts</w:t>
       </w:r>
     </w:p>
     <w:p>

</xml_diff>

<commit_message>
Update REFERENCES for V1.2 guides, phase 2 dataset, About/Disclaimer and OG image
</commit_message>
<xml_diff>
--- a/REFERENCES.docx
+++ b/REFERENCES.docx
@@ -554,6 +554,112 @@
         <w:spacing w:after="60"/>
       </w:pPr>
       <w:r>
+        <w:t xml:space="preserve">Commercial gel dataset (phase 2, powers calculator mode 3): </w:t>
+      </w:r>
+      <w:r>
+        <w:rPr>
+          <w:rFonts w:ascii="Consolas" w:cs="Consolas" w:eastAsia="Consolas" w:hAnsi="Consolas"/>
+          <w:sz w:val="20"/>
+          <w:szCs w:val="20"/>
+        </w:rPr>
+        <w:t xml:space="preserve">src/data/gels.ts</w:t>
+      </w:r>
+    </w:p>
+    <w:p>
+      <w:pPr>
+        <w:pStyle w:val="ListParagraph"/>
+        <w:numPr>
+          <w:ilvl w:val="0"/>
+          <w:numId w:val="2"/>
+        </w:numPr>
+        <w:spacing w:after="60"/>
+      </w:pPr>
+      <w:r>
+        <w:t xml:space="preserve">Guides: </w:t>
+      </w:r>
+      <w:r>
+        <w:rPr>
+          <w:rFonts w:ascii="Consolas" w:cs="Consolas" w:eastAsia="Consolas" w:hAnsi="Consolas"/>
+          <w:sz w:val="20"/>
+          <w:szCs w:val="20"/>
+        </w:rPr>
+        <w:t xml:space="preserve">src/pages/marathon-gel-guide.astro</w:t>
+      </w:r>
+      <w:r>
+        <w:t xml:space="preserve">, </w:t>
+      </w:r>
+      <w:r>
+        <w:rPr>
+          <w:rFonts w:ascii="Consolas" w:cs="Consolas" w:eastAsia="Consolas" w:hAnsi="Consolas"/>
+          <w:sz w:val="20"/>
+          <w:szCs w:val="20"/>
+        </w:rPr>
+        <w:t xml:space="preserve">src/pages/hyrox-gel-guide.astro</w:t>
+      </w:r>
+    </w:p>
+    <w:p>
+      <w:pPr>
+        <w:pStyle w:val="ListParagraph"/>
+        <w:numPr>
+          <w:ilvl w:val="0"/>
+          <w:numId w:val="2"/>
+        </w:numPr>
+        <w:spacing w:after="60"/>
+      </w:pPr>
+      <w:r>
+        <w:t xml:space="preserve">About / Disclaimer: </w:t>
+      </w:r>
+      <w:r>
+        <w:rPr>
+          <w:rFonts w:ascii="Consolas" w:cs="Consolas" w:eastAsia="Consolas" w:hAnsi="Consolas"/>
+          <w:sz w:val="20"/>
+          <w:szCs w:val="20"/>
+        </w:rPr>
+        <w:t xml:space="preserve">src/pages/about.astro</w:t>
+      </w:r>
+      <w:r>
+        <w:t xml:space="preserve">, </w:t>
+      </w:r>
+      <w:r>
+        <w:rPr>
+          <w:rFonts w:ascii="Consolas" w:cs="Consolas" w:eastAsia="Consolas" w:hAnsi="Consolas"/>
+          <w:sz w:val="20"/>
+          <w:szCs w:val="20"/>
+        </w:rPr>
+        <w:t xml:space="preserve">src/pages/disclaimer.astro</w:t>
+      </w:r>
+    </w:p>
+    <w:p>
+      <w:pPr>
+        <w:pStyle w:val="ListParagraph"/>
+        <w:numPr>
+          <w:ilvl w:val="0"/>
+          <w:numId w:val="2"/>
+        </w:numPr>
+        <w:spacing w:after="60"/>
+      </w:pPr>
+      <w:r>
+        <w:t xml:space="preserve">Default OG/social image: </w:t>
+      </w:r>
+      <w:r>
+        <w:rPr>
+          <w:rFonts w:ascii="Consolas" w:cs="Consolas" w:eastAsia="Consolas" w:hAnsi="Consolas"/>
+          <w:sz w:val="20"/>
+          <w:szCs w:val="20"/>
+        </w:rPr>
+        <w:t xml:space="preserve">public/images/social/default-og.png</w:t>
+      </w:r>
+    </w:p>
+    <w:p>
+      <w:pPr>
+        <w:pStyle w:val="ListParagraph"/>
+        <w:numPr>
+          <w:ilvl w:val="0"/>
+          <w:numId w:val="2"/>
+        </w:numPr>
+        <w:spacing w:after="60"/>
+      </w:pPr>
+      <w:r>
         <w:t xml:space="preserve">Layouts: </w:t>
       </w:r>
       <w:r>
@@ -687,7 +793,28 @@
         <w:spacing w:after="120"/>
       </w:pPr>
       <w:r>
-        <w:t xml:space="preserve">Mirroring the hotels project convention — none created yet:</w:t>
+        <w:t xml:space="preserve">Mirroring the hotels project convention:</w:t>
+      </w:r>
+    </w:p>
+    <w:p>
+      <w:pPr>
+        <w:pStyle w:val="ListParagraph"/>
+        <w:numPr>
+          <w:ilvl w:val="0"/>
+          <w:numId w:val="2"/>
+        </w:numPr>
+        <w:spacing w:after="60"/>
+      </w:pPr>
+      <w:r>
+        <w:rPr>
+          <w:rFonts w:ascii="Consolas" w:cs="Consolas" w:eastAsia="Consolas" w:hAnsi="Consolas"/>
+          <w:sz w:val="20"/>
+          <w:szCs w:val="20"/>
+        </w:rPr>
+        <w:t xml:space="preserve">public/images/social/</w:t>
+      </w:r>
+      <w:r>
+        <w:t xml:space="preserve"> — OG/social images</w:t>
       </w:r>
     </w:p>
     <w:p>
@@ -708,7 +835,7 @@
         <w:t xml:space="preserve">research/</w:t>
       </w:r>
       <w:r>
-        <w:t xml:space="preserve"> — [TODO: create when research material accumulates]</w:t>
+        <w:t xml:space="preserve"> — [TODO: create when research material accumulates; first job: verify the gels.ts dataset prices]</w:t>
       </w:r>
     </w:p>
     <w:p>
@@ -730,27 +857,6 @@
       </w:r>
       <w:r>
         <w:t xml:space="preserve"> — [TODO: create when helper scripts are needed]</w:t>
-      </w:r>
-    </w:p>
-    <w:p>
-      <w:pPr>
-        <w:pStyle w:val="ListParagraph"/>
-        <w:numPr>
-          <w:ilvl w:val="0"/>
-          <w:numId w:val="2"/>
-        </w:numPr>
-        <w:spacing w:after="60"/>
-      </w:pPr>
-      <w:r>
-        <w:rPr>
-          <w:rFonts w:ascii="Consolas" w:cs="Consolas" w:eastAsia="Consolas" w:hAnsi="Consolas"/>
-          <w:sz w:val="20"/>
-          <w:szCs w:val="20"/>
-        </w:rPr>
-        <w:t xml:space="preserve">public/images/</w:t>
-      </w:r>
-      <w:r>
-        <w:t xml:space="preserve"> — [TODO: create when the site gets imagery]</w:t>
       </w:r>
     </w:p>
     <w:p>

</xml_diff>